<commit_message>
Rectified Word File Errors
</commit_message>
<xml_diff>
--- a/Security Audit Botium Toys.docx
+++ b/Security Audit Botium Toys.docx
@@ -12,7 +12,7 @@
           <w:szCs w:val="24"/>
         </w:rPr>
       </w:pPr>
-      <w:bookmarkStart w:colFirst="0" w:colLast="0" w:name="_87tykp1u0l36" w:id="0"/>
+      <w:bookmarkStart w:colFirst="0" w:colLast="0" w:name="_n2ss8mwikw8x" w:id="0"/>
       <w:bookmarkEnd w:id="0"/>
       <w:r>
         <w:rPr>
@@ -335,7 +335,7 @@
               <w:widowControl w:val="0"/>
               <w:numPr>
                 <w:ilvl w:val="0"/>
-                <w:numId w:val="13"/>
+                <w:numId w:val="4"/>
               </w:numPr>
               <w:spacing w:line="240" w:lineRule="auto"/>
               <w:ind w:left="720" w:hanging="360"/>
@@ -348,7 +348,6 @@
             </w:pPr>
             <w:r>
               <w:rPr>
-                <w:strike w:val="1"/>
                 <w:rtl w:val="0"/>
               </w:rPr>
             </w:r>
@@ -449,9 +448,39 @@
           <w:p>
             <w:pPr>
               <w:widowControl w:val="0"/>
+              <w:spacing w:line="240" w:lineRule="auto"/>
+              <w:ind w:left="720" w:firstLine="0"/>
+              <w:jc w:val="both"/>
+              <w:rPr>
+                <w:rFonts w:ascii="Google Sans" w:cs="Google Sans" w:eastAsia="Google Sans" w:hAnsi="Google Sans"/>
+                <w:sz w:val="24"/>
+                <w:szCs w:val="24"/>
+              </w:rPr>
+            </w:pPr>
+            <w:r>
+              <w:rPr>
+                <w:rtl w:val="0"/>
+              </w:rPr>
+            </w:r>
+          </w:p>
+        </w:tc>
+        <w:tc>
+          <w:tcPr>
+            <w:shd w:fill="auto" w:val="clear"/>
+            <w:tcMar>
+              <w:top w:w="100.0" w:type="dxa"/>
+              <w:left w:w="100.0" w:type="dxa"/>
+              <w:bottom w:w="100.0" w:type="dxa"/>
+              <w:right w:w="100.0" w:type="dxa"/>
+            </w:tcMar>
+            <w:vAlign w:val="top"/>
+          </w:tcPr>
+          <w:p>
+            <w:pPr>
+              <w:widowControl w:val="0"/>
               <w:numPr>
                 <w:ilvl w:val="0"/>
-                <w:numId w:val="20"/>
+                <w:numId w:val="7"/>
               </w:numPr>
               <w:spacing w:line="240" w:lineRule="auto"/>
               <w:ind w:left="720" w:hanging="360"/>
@@ -464,41 +493,6 @@
             </w:pPr>
             <w:r>
               <w:rPr>
-                <w:rtl w:val="0"/>
-              </w:rPr>
-            </w:r>
-          </w:p>
-        </w:tc>
-        <w:tc>
-          <w:tcPr>
-            <w:shd w:fill="auto" w:val="clear"/>
-            <w:tcMar>
-              <w:top w:w="100.0" w:type="dxa"/>
-              <w:left w:w="100.0" w:type="dxa"/>
-              <w:bottom w:w="100.0" w:type="dxa"/>
-              <w:right w:w="100.0" w:type="dxa"/>
-            </w:tcMar>
-            <w:vAlign w:val="top"/>
-          </w:tcPr>
-          <w:p>
-            <w:pPr>
-              <w:widowControl w:val="0"/>
-              <w:numPr>
-                <w:ilvl w:val="0"/>
-                <w:numId w:val="19"/>
-              </w:numPr>
-              <w:spacing w:line="240" w:lineRule="auto"/>
-              <w:ind w:left="720" w:hanging="360"/>
-              <w:jc w:val="both"/>
-              <w:rPr>
-                <w:rFonts w:ascii="Google Sans" w:cs="Google Sans" w:eastAsia="Google Sans" w:hAnsi="Google Sans"/>
-                <w:sz w:val="24"/>
-                <w:szCs w:val="24"/>
-              </w:rPr>
-            </w:pPr>
-            <w:r>
-              <w:rPr>
-                <w:strike w:val="1"/>
                 <w:rtl w:val="0"/>
               </w:rPr>
             </w:r>
@@ -588,9 +582,39 @@
           <w:p>
             <w:pPr>
               <w:widowControl w:val="0"/>
+              <w:spacing w:line="240" w:lineRule="auto"/>
+              <w:ind w:left="720" w:firstLine="0"/>
+              <w:jc w:val="both"/>
+              <w:rPr>
+                <w:rFonts w:ascii="Google Sans" w:cs="Google Sans" w:eastAsia="Google Sans" w:hAnsi="Google Sans"/>
+                <w:sz w:val="24"/>
+                <w:szCs w:val="24"/>
+              </w:rPr>
+            </w:pPr>
+            <w:r>
+              <w:rPr>
+                <w:rtl w:val="0"/>
+              </w:rPr>
+            </w:r>
+          </w:p>
+        </w:tc>
+        <w:tc>
+          <w:tcPr>
+            <w:shd w:fill="auto" w:val="clear"/>
+            <w:tcMar>
+              <w:top w:w="100.0" w:type="dxa"/>
+              <w:left w:w="100.0" w:type="dxa"/>
+              <w:bottom w:w="100.0" w:type="dxa"/>
+              <w:right w:w="100.0" w:type="dxa"/>
+            </w:tcMar>
+            <w:vAlign w:val="top"/>
+          </w:tcPr>
+          <w:p>
+            <w:pPr>
+              <w:widowControl w:val="0"/>
               <w:numPr>
                 <w:ilvl w:val="0"/>
-                <w:numId w:val="15"/>
+                <w:numId w:val="14"/>
               </w:numPr>
               <w:spacing w:line="240" w:lineRule="auto"/>
               <w:ind w:left="720" w:hanging="360"/>
@@ -603,41 +627,6 @@
             </w:pPr>
             <w:r>
               <w:rPr>
-                <w:rtl w:val="0"/>
-              </w:rPr>
-            </w:r>
-          </w:p>
-        </w:tc>
-        <w:tc>
-          <w:tcPr>
-            <w:shd w:fill="auto" w:val="clear"/>
-            <w:tcMar>
-              <w:top w:w="100.0" w:type="dxa"/>
-              <w:left w:w="100.0" w:type="dxa"/>
-              <w:bottom w:w="100.0" w:type="dxa"/>
-              <w:right w:w="100.0" w:type="dxa"/>
-            </w:tcMar>
-            <w:vAlign w:val="top"/>
-          </w:tcPr>
-          <w:p>
-            <w:pPr>
-              <w:widowControl w:val="0"/>
-              <w:numPr>
-                <w:ilvl w:val="0"/>
-                <w:numId w:val="8"/>
-              </w:numPr>
-              <w:spacing w:line="240" w:lineRule="auto"/>
-              <w:ind w:left="720" w:hanging="360"/>
-              <w:jc w:val="both"/>
-              <w:rPr>
-                <w:rFonts w:ascii="Google Sans" w:cs="Google Sans" w:eastAsia="Google Sans" w:hAnsi="Google Sans"/>
-                <w:sz w:val="24"/>
-                <w:szCs w:val="24"/>
-              </w:rPr>
-            </w:pPr>
-            <w:r>
-              <w:rPr>
-                <w:strike w:val="1"/>
                 <w:rtl w:val="0"/>
               </w:rPr>
             </w:r>
@@ -731,9 +720,39 @@
           <w:p>
             <w:pPr>
               <w:widowControl w:val="0"/>
+              <w:spacing w:line="240" w:lineRule="auto"/>
+              <w:ind w:left="720" w:firstLine="0"/>
+              <w:jc w:val="both"/>
+              <w:rPr>
+                <w:rFonts w:ascii="Google Sans" w:cs="Google Sans" w:eastAsia="Google Sans" w:hAnsi="Google Sans"/>
+                <w:sz w:val="24"/>
+                <w:szCs w:val="24"/>
+              </w:rPr>
+            </w:pPr>
+            <w:r>
+              <w:rPr>
+                <w:rtl w:val="0"/>
+              </w:rPr>
+            </w:r>
+          </w:p>
+        </w:tc>
+        <w:tc>
+          <w:tcPr>
+            <w:shd w:fill="auto" w:val="clear"/>
+            <w:tcMar>
+              <w:top w:w="100.0" w:type="dxa"/>
+              <w:left w:w="100.0" w:type="dxa"/>
+              <w:bottom w:w="100.0" w:type="dxa"/>
+              <w:right w:w="100.0" w:type="dxa"/>
+            </w:tcMar>
+            <w:vAlign w:val="top"/>
+          </w:tcPr>
+          <w:p>
+            <w:pPr>
+              <w:widowControl w:val="0"/>
               <w:numPr>
                 <w:ilvl w:val="0"/>
-                <w:numId w:val="2"/>
+                <w:numId w:val="3"/>
               </w:numPr>
               <w:spacing w:line="240" w:lineRule="auto"/>
               <w:ind w:left="720" w:hanging="360"/>
@@ -746,41 +765,6 @@
             </w:pPr>
             <w:r>
               <w:rPr>
-                <w:rtl w:val="0"/>
-              </w:rPr>
-            </w:r>
-          </w:p>
-        </w:tc>
-        <w:tc>
-          <w:tcPr>
-            <w:shd w:fill="auto" w:val="clear"/>
-            <w:tcMar>
-              <w:top w:w="100.0" w:type="dxa"/>
-              <w:left w:w="100.0" w:type="dxa"/>
-              <w:bottom w:w="100.0" w:type="dxa"/>
-              <w:right w:w="100.0" w:type="dxa"/>
-            </w:tcMar>
-            <w:vAlign w:val="top"/>
-          </w:tcPr>
-          <w:p>
-            <w:pPr>
-              <w:widowControl w:val="0"/>
-              <w:numPr>
-                <w:ilvl w:val="0"/>
-                <w:numId w:val="12"/>
-              </w:numPr>
-              <w:spacing w:line="240" w:lineRule="auto"/>
-              <w:ind w:left="720" w:hanging="360"/>
-              <w:jc w:val="both"/>
-              <w:rPr>
-                <w:rFonts w:ascii="Google Sans" w:cs="Google Sans" w:eastAsia="Google Sans" w:hAnsi="Google Sans"/>
-                <w:sz w:val="24"/>
-                <w:szCs w:val="24"/>
-              </w:rPr>
-            </w:pPr>
-            <w:r>
-              <w:rPr>
-                <w:strike w:val="1"/>
                 <w:rtl w:val="0"/>
               </w:rPr>
             </w:r>
@@ -876,7 +860,7 @@
               <w:widowControl w:val="0"/>
               <w:numPr>
                 <w:ilvl w:val="0"/>
-                <w:numId w:val="11"/>
+                <w:numId w:val="2"/>
               </w:numPr>
               <w:spacing w:line="240" w:lineRule="auto"/>
               <w:ind w:left="720" w:hanging="360"/>
@@ -889,32 +873,27 @@
             </w:pPr>
             <w:r>
               <w:rPr>
-                <w:strike w:val="1"/>
-                <w:rtl w:val="0"/>
-              </w:rPr>
-            </w:r>
-          </w:p>
-        </w:tc>
-        <w:tc>
-          <w:tcPr>
-            <w:shd w:fill="auto" w:val="clear"/>
-            <w:tcMar>
-              <w:top w:w="100.0" w:type="dxa"/>
-              <w:left w:w="100.0" w:type="dxa"/>
-              <w:bottom w:w="100.0" w:type="dxa"/>
-              <w:right w:w="100.0" w:type="dxa"/>
-            </w:tcMar>
-            <w:vAlign w:val="top"/>
-          </w:tcPr>
-          <w:p>
-            <w:pPr>
-              <w:widowControl w:val="0"/>
-              <w:numPr>
-                <w:ilvl w:val="0"/>
-                <w:numId w:val="17"/>
-              </w:numPr>
-              <w:spacing w:line="240" w:lineRule="auto"/>
-              <w:ind w:left="720" w:hanging="360"/>
+                <w:rtl w:val="0"/>
+              </w:rPr>
+            </w:r>
+          </w:p>
+        </w:tc>
+        <w:tc>
+          <w:tcPr>
+            <w:shd w:fill="auto" w:val="clear"/>
+            <w:tcMar>
+              <w:top w:w="100.0" w:type="dxa"/>
+              <w:left w:w="100.0" w:type="dxa"/>
+              <w:bottom w:w="100.0" w:type="dxa"/>
+              <w:right w:w="100.0" w:type="dxa"/>
+            </w:tcMar>
+            <w:vAlign w:val="top"/>
+          </w:tcPr>
+          <w:p>
+            <w:pPr>
+              <w:widowControl w:val="0"/>
+              <w:spacing w:line="240" w:lineRule="auto"/>
+              <w:ind w:left="720" w:firstLine="0"/>
               <w:jc w:val="both"/>
               <w:rPr>
                 <w:rFonts w:ascii="Google Sans" w:cs="Google Sans" w:eastAsia="Google Sans" w:hAnsi="Google Sans"/>
@@ -1141,9 +1120,39 @@
           <w:p>
             <w:pPr>
               <w:widowControl w:val="0"/>
+              <w:spacing w:line="240" w:lineRule="auto"/>
+              <w:ind w:left="720" w:firstLine="0"/>
+              <w:jc w:val="both"/>
+              <w:rPr>
+                <w:rFonts w:ascii="Google Sans" w:cs="Google Sans" w:eastAsia="Google Sans" w:hAnsi="Google Sans"/>
+                <w:sz w:val="24"/>
+                <w:szCs w:val="24"/>
+              </w:rPr>
+            </w:pPr>
+            <w:r>
+              <w:rPr>
+                <w:rtl w:val="0"/>
+              </w:rPr>
+            </w:r>
+          </w:p>
+        </w:tc>
+        <w:tc>
+          <w:tcPr>
+            <w:shd w:fill="auto" w:val="clear"/>
+            <w:tcMar>
+              <w:top w:w="100.0" w:type="dxa"/>
+              <w:left w:w="100.0" w:type="dxa"/>
+              <w:bottom w:w="100.0" w:type="dxa"/>
+              <w:right w:w="100.0" w:type="dxa"/>
+            </w:tcMar>
+            <w:vAlign w:val="top"/>
+          </w:tcPr>
+          <w:p>
+            <w:pPr>
+              <w:widowControl w:val="0"/>
               <w:numPr>
                 <w:ilvl w:val="0"/>
-                <w:numId w:val="18"/>
+                <w:numId w:val="10"/>
               </w:numPr>
               <w:spacing w:line="240" w:lineRule="auto"/>
               <w:ind w:left="720" w:hanging="360"/>
@@ -1156,41 +1165,6 @@
             </w:pPr>
             <w:r>
               <w:rPr>
-                <w:rtl w:val="0"/>
-              </w:rPr>
-            </w:r>
-          </w:p>
-        </w:tc>
-        <w:tc>
-          <w:tcPr>
-            <w:shd w:fill="auto" w:val="clear"/>
-            <w:tcMar>
-              <w:top w:w="100.0" w:type="dxa"/>
-              <w:left w:w="100.0" w:type="dxa"/>
-              <w:bottom w:w="100.0" w:type="dxa"/>
-              <w:right w:w="100.0" w:type="dxa"/>
-            </w:tcMar>
-            <w:vAlign w:val="top"/>
-          </w:tcPr>
-          <w:p>
-            <w:pPr>
-              <w:widowControl w:val="0"/>
-              <w:numPr>
-                <w:ilvl w:val="0"/>
-                <w:numId w:val="4"/>
-              </w:numPr>
-              <w:spacing w:line="240" w:lineRule="auto"/>
-              <w:ind w:left="720" w:hanging="360"/>
-              <w:jc w:val="both"/>
-              <w:rPr>
-                <w:rFonts w:ascii="Google Sans" w:cs="Google Sans" w:eastAsia="Google Sans" w:hAnsi="Google Sans"/>
-                <w:sz w:val="24"/>
-                <w:szCs w:val="24"/>
-              </w:rPr>
-            </w:pPr>
-            <w:r>
-              <w:rPr>
-                <w:strike w:val="1"/>
                 <w:rtl w:val="0"/>
               </w:rPr>
             </w:r>
@@ -1284,9 +1258,39 @@
           <w:p>
             <w:pPr>
               <w:widowControl w:val="0"/>
+              <w:spacing w:line="240" w:lineRule="auto"/>
+              <w:ind w:left="720" w:firstLine="0"/>
+              <w:jc w:val="both"/>
+              <w:rPr>
+                <w:rFonts w:ascii="Google Sans" w:cs="Google Sans" w:eastAsia="Google Sans" w:hAnsi="Google Sans"/>
+                <w:sz w:val="24"/>
+                <w:szCs w:val="24"/>
+              </w:rPr>
+            </w:pPr>
+            <w:r>
+              <w:rPr>
+                <w:rtl w:val="0"/>
+              </w:rPr>
+            </w:r>
+          </w:p>
+        </w:tc>
+        <w:tc>
+          <w:tcPr>
+            <w:shd w:fill="auto" w:val="clear"/>
+            <w:tcMar>
+              <w:top w:w="100.0" w:type="dxa"/>
+              <w:left w:w="100.0" w:type="dxa"/>
+              <w:bottom w:w="100.0" w:type="dxa"/>
+              <w:right w:w="100.0" w:type="dxa"/>
+            </w:tcMar>
+            <w:vAlign w:val="top"/>
+          </w:tcPr>
+          <w:p>
+            <w:pPr>
+              <w:widowControl w:val="0"/>
               <w:numPr>
                 <w:ilvl w:val="0"/>
-                <w:numId w:val="3"/>
+                <w:numId w:val="5"/>
               </w:numPr>
               <w:spacing w:line="240" w:lineRule="auto"/>
               <w:ind w:left="720" w:hanging="360"/>
@@ -1299,41 +1303,6 @@
             </w:pPr>
             <w:r>
               <w:rPr>
-                <w:rtl w:val="0"/>
-              </w:rPr>
-            </w:r>
-          </w:p>
-        </w:tc>
-        <w:tc>
-          <w:tcPr>
-            <w:shd w:fill="auto" w:val="clear"/>
-            <w:tcMar>
-              <w:top w:w="100.0" w:type="dxa"/>
-              <w:left w:w="100.0" w:type="dxa"/>
-              <w:bottom w:w="100.0" w:type="dxa"/>
-              <w:right w:w="100.0" w:type="dxa"/>
-            </w:tcMar>
-            <w:vAlign w:val="top"/>
-          </w:tcPr>
-          <w:p>
-            <w:pPr>
-              <w:widowControl w:val="0"/>
-              <w:numPr>
-                <w:ilvl w:val="0"/>
-                <w:numId w:val="14"/>
-              </w:numPr>
-              <w:spacing w:line="240" w:lineRule="auto"/>
-              <w:ind w:left="720" w:hanging="360"/>
-              <w:jc w:val="both"/>
-              <w:rPr>
-                <w:rFonts w:ascii="Google Sans" w:cs="Google Sans" w:eastAsia="Google Sans" w:hAnsi="Google Sans"/>
-                <w:sz w:val="24"/>
-                <w:szCs w:val="24"/>
-              </w:rPr>
-            </w:pPr>
-            <w:r>
-              <w:rPr>
-                <w:strike w:val="1"/>
                 <w:rtl w:val="0"/>
               </w:rPr>
             </w:r>
@@ -1429,7 +1398,7 @@
               <w:widowControl w:val="0"/>
               <w:numPr>
                 <w:ilvl w:val="0"/>
-                <w:numId w:val="6"/>
+                <w:numId w:val="12"/>
               </w:numPr>
               <w:spacing w:line="240" w:lineRule="auto"/>
               <w:ind w:left="720" w:hanging="360"/>
@@ -1442,32 +1411,27 @@
             </w:pPr>
             <w:r>
               <w:rPr>
-                <w:strike w:val="1"/>
-                <w:rtl w:val="0"/>
-              </w:rPr>
-            </w:r>
-          </w:p>
-        </w:tc>
-        <w:tc>
-          <w:tcPr>
-            <w:shd w:fill="auto" w:val="clear"/>
-            <w:tcMar>
-              <w:top w:w="100.0" w:type="dxa"/>
-              <w:left w:w="100.0" w:type="dxa"/>
-              <w:bottom w:w="100.0" w:type="dxa"/>
-              <w:right w:w="100.0" w:type="dxa"/>
-            </w:tcMar>
-            <w:vAlign w:val="top"/>
-          </w:tcPr>
-          <w:p>
-            <w:pPr>
-              <w:widowControl w:val="0"/>
-              <w:numPr>
-                <w:ilvl w:val="0"/>
-                <w:numId w:val="16"/>
-              </w:numPr>
-              <w:spacing w:line="240" w:lineRule="auto"/>
-              <w:ind w:left="720" w:hanging="360"/>
+                <w:rtl w:val="0"/>
+              </w:rPr>
+            </w:r>
+          </w:p>
+        </w:tc>
+        <w:tc>
+          <w:tcPr>
+            <w:shd w:fill="auto" w:val="clear"/>
+            <w:tcMar>
+              <w:top w:w="100.0" w:type="dxa"/>
+              <w:left w:w="100.0" w:type="dxa"/>
+              <w:bottom w:w="100.0" w:type="dxa"/>
+              <w:right w:w="100.0" w:type="dxa"/>
+            </w:tcMar>
+            <w:vAlign w:val="top"/>
+          </w:tcPr>
+          <w:p>
+            <w:pPr>
+              <w:widowControl w:val="0"/>
+              <w:spacing w:line="240" w:lineRule="auto"/>
+              <w:ind w:left="720" w:firstLine="0"/>
               <w:jc w:val="both"/>
               <w:rPr>
                 <w:rFonts w:ascii="Google Sans" w:cs="Google Sans" w:eastAsia="Google Sans" w:hAnsi="Google Sans"/>
@@ -1570,9 +1534,39 @@
           <w:p>
             <w:pPr>
               <w:widowControl w:val="0"/>
+              <w:spacing w:line="240" w:lineRule="auto"/>
+              <w:ind w:left="720" w:firstLine="0"/>
+              <w:jc w:val="both"/>
+              <w:rPr>
+                <w:rFonts w:ascii="Google Sans" w:cs="Google Sans" w:eastAsia="Google Sans" w:hAnsi="Google Sans"/>
+                <w:sz w:val="24"/>
+                <w:szCs w:val="24"/>
+              </w:rPr>
+            </w:pPr>
+            <w:r>
+              <w:rPr>
+                <w:rtl w:val="0"/>
+              </w:rPr>
+            </w:r>
+          </w:p>
+        </w:tc>
+        <w:tc>
+          <w:tcPr>
+            <w:shd w:fill="auto" w:val="clear"/>
+            <w:tcMar>
+              <w:top w:w="100.0" w:type="dxa"/>
+              <w:left w:w="100.0" w:type="dxa"/>
+              <w:bottom w:w="100.0" w:type="dxa"/>
+              <w:right w:w="100.0" w:type="dxa"/>
+            </w:tcMar>
+            <w:vAlign w:val="top"/>
+          </w:tcPr>
+          <w:p>
+            <w:pPr>
+              <w:widowControl w:val="0"/>
               <w:numPr>
                 <w:ilvl w:val="0"/>
-                <w:numId w:val="10"/>
+                <w:numId w:val="11"/>
               </w:numPr>
               <w:spacing w:line="240" w:lineRule="auto"/>
               <w:ind w:left="720" w:hanging="360"/>
@@ -1585,41 +1579,6 @@
             </w:pPr>
             <w:r>
               <w:rPr>
-                <w:rtl w:val="0"/>
-              </w:rPr>
-            </w:r>
-          </w:p>
-        </w:tc>
-        <w:tc>
-          <w:tcPr>
-            <w:shd w:fill="auto" w:val="clear"/>
-            <w:tcMar>
-              <w:top w:w="100.0" w:type="dxa"/>
-              <w:left w:w="100.0" w:type="dxa"/>
-              <w:bottom w:w="100.0" w:type="dxa"/>
-              <w:right w:w="100.0" w:type="dxa"/>
-            </w:tcMar>
-            <w:vAlign w:val="top"/>
-          </w:tcPr>
-          <w:p>
-            <w:pPr>
-              <w:widowControl w:val="0"/>
-              <w:numPr>
-                <w:ilvl w:val="0"/>
-                <w:numId w:val="5"/>
-              </w:numPr>
-              <w:spacing w:line="240" w:lineRule="auto"/>
-              <w:ind w:left="720" w:hanging="360"/>
-              <w:jc w:val="both"/>
-              <w:rPr>
-                <w:rFonts w:ascii="Google Sans" w:cs="Google Sans" w:eastAsia="Google Sans" w:hAnsi="Google Sans"/>
-                <w:sz w:val="24"/>
-                <w:szCs w:val="24"/>
-              </w:rPr>
-            </w:pPr>
-            <w:r>
-              <w:rPr>
-                <w:strike w:val="1"/>
                 <w:rtl w:val="0"/>
               </w:rPr>
             </w:r>
@@ -1749,7 +1708,7 @@
               <w:widowControl w:val="0"/>
               <w:numPr>
                 <w:ilvl w:val="0"/>
-                <w:numId w:val="13"/>
+                <w:numId w:val="4"/>
               </w:numPr>
               <w:spacing w:line="240" w:lineRule="auto"/>
               <w:ind w:left="720" w:hanging="360"/>
@@ -1762,7 +1721,6 @@
             </w:pPr>
             <w:r>
               <w:rPr>
-                <w:strike w:val="1"/>
                 <w:rtl w:val="0"/>
               </w:rPr>
             </w:r>
@@ -1856,9 +1814,39 @@
           <w:p>
             <w:pPr>
               <w:widowControl w:val="0"/>
+              <w:spacing w:line="240" w:lineRule="auto"/>
+              <w:ind w:left="720" w:firstLine="0"/>
+              <w:jc w:val="both"/>
+              <w:rPr>
+                <w:rFonts w:ascii="Google Sans" w:cs="Google Sans" w:eastAsia="Google Sans" w:hAnsi="Google Sans"/>
+                <w:sz w:val="24"/>
+                <w:szCs w:val="24"/>
+              </w:rPr>
+            </w:pPr>
+            <w:r>
+              <w:rPr>
+                <w:rtl w:val="0"/>
+              </w:rPr>
+            </w:r>
+          </w:p>
+        </w:tc>
+        <w:tc>
+          <w:tcPr>
+            <w:shd w:fill="auto" w:val="clear"/>
+            <w:tcMar>
+              <w:top w:w="100.0" w:type="dxa"/>
+              <w:left w:w="100.0" w:type="dxa"/>
+              <w:bottom w:w="100.0" w:type="dxa"/>
+              <w:right w:w="100.0" w:type="dxa"/>
+            </w:tcMar>
+            <w:vAlign w:val="top"/>
+          </w:tcPr>
+          <w:p>
+            <w:pPr>
+              <w:widowControl w:val="0"/>
               <w:numPr>
                 <w:ilvl w:val="0"/>
-                <w:numId w:val="20"/>
+                <w:numId w:val="7"/>
               </w:numPr>
               <w:spacing w:line="240" w:lineRule="auto"/>
               <w:ind w:left="720" w:hanging="360"/>
@@ -1871,41 +1859,6 @@
             </w:pPr>
             <w:r>
               <w:rPr>
-                <w:rtl w:val="0"/>
-              </w:rPr>
-            </w:r>
-          </w:p>
-        </w:tc>
-        <w:tc>
-          <w:tcPr>
-            <w:shd w:fill="auto" w:val="clear"/>
-            <w:tcMar>
-              <w:top w:w="100.0" w:type="dxa"/>
-              <w:left w:w="100.0" w:type="dxa"/>
-              <w:bottom w:w="100.0" w:type="dxa"/>
-              <w:right w:w="100.0" w:type="dxa"/>
-            </w:tcMar>
-            <w:vAlign w:val="top"/>
-          </w:tcPr>
-          <w:p>
-            <w:pPr>
-              <w:widowControl w:val="0"/>
-              <w:numPr>
-                <w:ilvl w:val="0"/>
-                <w:numId w:val="19"/>
-              </w:numPr>
-              <w:spacing w:line="240" w:lineRule="auto"/>
-              <w:ind w:left="720" w:hanging="360"/>
-              <w:jc w:val="both"/>
-              <w:rPr>
-                <w:rFonts w:ascii="Google Sans" w:cs="Google Sans" w:eastAsia="Google Sans" w:hAnsi="Google Sans"/>
-                <w:sz w:val="24"/>
-                <w:szCs w:val="24"/>
-              </w:rPr>
-            </w:pPr>
-            <w:r>
-              <w:rPr>
-                <w:strike w:val="1"/>
                 <w:rtl w:val="0"/>
               </w:rPr>
             </w:r>
@@ -2001,7 +1954,7 @@
               <w:widowControl w:val="0"/>
               <w:numPr>
                 <w:ilvl w:val="0"/>
-                <w:numId w:val="7"/>
+                <w:numId w:val="13"/>
               </w:numPr>
               <w:spacing w:line="240" w:lineRule="auto"/>
               <w:ind w:left="720" w:hanging="360"/>
@@ -2014,32 +1967,27 @@
             </w:pPr>
             <w:r>
               <w:rPr>
-                <w:strike w:val="1"/>
-                <w:rtl w:val="0"/>
-              </w:rPr>
-            </w:r>
-          </w:p>
-        </w:tc>
-        <w:tc>
-          <w:tcPr>
-            <w:shd w:fill="auto" w:val="clear"/>
-            <w:tcMar>
-              <w:top w:w="100.0" w:type="dxa"/>
-              <w:left w:w="100.0" w:type="dxa"/>
-              <w:bottom w:w="100.0" w:type="dxa"/>
-              <w:right w:w="100.0" w:type="dxa"/>
-            </w:tcMar>
-            <w:vAlign w:val="top"/>
-          </w:tcPr>
-          <w:p>
-            <w:pPr>
-              <w:widowControl w:val="0"/>
-              <w:numPr>
-                <w:ilvl w:val="0"/>
-                <w:numId w:val="9"/>
-              </w:numPr>
-              <w:spacing w:line="240" w:lineRule="auto"/>
-              <w:ind w:left="720" w:hanging="360"/>
+                <w:rtl w:val="0"/>
+              </w:rPr>
+            </w:r>
+          </w:p>
+        </w:tc>
+        <w:tc>
+          <w:tcPr>
+            <w:shd w:fill="auto" w:val="clear"/>
+            <w:tcMar>
+              <w:top w:w="100.0" w:type="dxa"/>
+              <w:left w:w="100.0" w:type="dxa"/>
+              <w:bottom w:w="100.0" w:type="dxa"/>
+              <w:right w:w="100.0" w:type="dxa"/>
+            </w:tcMar>
+            <w:vAlign w:val="top"/>
+          </w:tcPr>
+          <w:p>
+            <w:pPr>
+              <w:widowControl w:val="0"/>
+              <w:spacing w:line="240" w:lineRule="auto"/>
+              <w:ind w:left="720" w:firstLine="0"/>
               <w:jc w:val="both"/>
               <w:rPr>
                 <w:rFonts w:ascii="Google Sans" w:cs="Google Sans" w:eastAsia="Google Sans" w:hAnsi="Google Sans"/>
@@ -2144,7 +2092,7 @@
               <w:widowControl w:val="0"/>
               <w:numPr>
                 <w:ilvl w:val="0"/>
-                <w:numId w:val="15"/>
+                <w:numId w:val="6"/>
               </w:numPr>
               <w:spacing w:line="240" w:lineRule="auto"/>
               <w:ind w:left="720" w:hanging="360"/>
@@ -2157,32 +2105,27 @@
             </w:pPr>
             <w:r>
               <w:rPr>
-                <w:strike w:val="1"/>
-                <w:rtl w:val="0"/>
-              </w:rPr>
-            </w:r>
-          </w:p>
-        </w:tc>
-        <w:tc>
-          <w:tcPr>
-            <w:shd w:fill="auto" w:val="clear"/>
-            <w:tcMar>
-              <w:top w:w="100.0" w:type="dxa"/>
-              <w:left w:w="100.0" w:type="dxa"/>
-              <w:bottom w:w="100.0" w:type="dxa"/>
-              <w:right w:w="100.0" w:type="dxa"/>
-            </w:tcMar>
-            <w:vAlign w:val="top"/>
-          </w:tcPr>
-          <w:p>
-            <w:pPr>
-              <w:widowControl w:val="0"/>
-              <w:numPr>
-                <w:ilvl w:val="0"/>
-                <w:numId w:val="8"/>
-              </w:numPr>
-              <w:spacing w:line="240" w:lineRule="auto"/>
-              <w:ind w:left="720" w:hanging="360"/>
+                <w:rtl w:val="0"/>
+              </w:rPr>
+            </w:r>
+          </w:p>
+        </w:tc>
+        <w:tc>
+          <w:tcPr>
+            <w:shd w:fill="auto" w:val="clear"/>
+            <w:tcMar>
+              <w:top w:w="100.0" w:type="dxa"/>
+              <w:left w:w="100.0" w:type="dxa"/>
+              <w:bottom w:w="100.0" w:type="dxa"/>
+              <w:right w:w="100.0" w:type="dxa"/>
+            </w:tcMar>
+            <w:vAlign w:val="top"/>
+          </w:tcPr>
+          <w:p>
+            <w:pPr>
+              <w:widowControl w:val="0"/>
+              <w:spacing w:line="240" w:lineRule="auto"/>
+              <w:ind w:left="720" w:firstLine="0"/>
               <w:jc w:val="both"/>
               <w:rPr>
                 <w:rFonts w:ascii="Google Sans" w:cs="Google Sans" w:eastAsia="Google Sans" w:hAnsi="Google Sans"/>
@@ -2287,7 +2230,7 @@
               <w:widowControl w:val="0"/>
               <w:numPr>
                 <w:ilvl w:val="0"/>
-                <w:numId w:val="7"/>
+                <w:numId w:val="13"/>
               </w:numPr>
               <w:spacing w:line="240" w:lineRule="auto"/>
               <w:ind w:left="720" w:hanging="360"/>
@@ -2300,32 +2243,27 @@
             </w:pPr>
             <w:r>
               <w:rPr>
-                <w:strike w:val="1"/>
-                <w:rtl w:val="0"/>
-              </w:rPr>
-            </w:r>
-          </w:p>
-        </w:tc>
-        <w:tc>
-          <w:tcPr>
-            <w:shd w:fill="auto" w:val="clear"/>
-            <w:tcMar>
-              <w:top w:w="100.0" w:type="dxa"/>
-              <w:left w:w="100.0" w:type="dxa"/>
-              <w:bottom w:w="100.0" w:type="dxa"/>
-              <w:right w:w="100.0" w:type="dxa"/>
-            </w:tcMar>
-            <w:vAlign w:val="top"/>
-          </w:tcPr>
-          <w:p>
-            <w:pPr>
-              <w:widowControl w:val="0"/>
-              <w:numPr>
-                <w:ilvl w:val="0"/>
-                <w:numId w:val="9"/>
-              </w:numPr>
-              <w:spacing w:line="240" w:lineRule="auto"/>
-              <w:ind w:left="720" w:hanging="360"/>
+                <w:rtl w:val="0"/>
+              </w:rPr>
+            </w:r>
+          </w:p>
+        </w:tc>
+        <w:tc>
+          <w:tcPr>
+            <w:shd w:fill="auto" w:val="clear"/>
+            <w:tcMar>
+              <w:top w:w="100.0" w:type="dxa"/>
+              <w:left w:w="100.0" w:type="dxa"/>
+              <w:bottom w:w="100.0" w:type="dxa"/>
+              <w:right w:w="100.0" w:type="dxa"/>
+            </w:tcMar>
+            <w:vAlign w:val="top"/>
+          </w:tcPr>
+          <w:p>
+            <w:pPr>
+              <w:widowControl w:val="0"/>
+              <w:spacing w:line="240" w:lineRule="auto"/>
+              <w:ind w:left="720" w:firstLine="0"/>
               <w:jc w:val="both"/>
               <w:rPr>
                 <w:rFonts w:ascii="Google Sans" w:cs="Google Sans" w:eastAsia="Google Sans" w:hAnsi="Google Sans"/>
@@ -2485,48 +2423,12 @@
           <w:rFonts w:ascii="Google Sans" w:cs="Google Sans" w:eastAsia="Google Sans" w:hAnsi="Google Sans"/>
           <w:b w:val="1"/>
           <w:bCs w:val="1"/>
-          <w:sz w:val="24"/>
-          <w:szCs w:val="24"/>
-        </w:rPr>
-      </w:pPr>
-      <w:r>
-        <w:rPr>
-          <w:rtl w:val="0"/>
-        </w:rPr>
-      </w:r>
-    </w:p>
-    <w:p>
-      <w:pPr>
-        <w:rPr>
-          <w:rFonts w:ascii="Google Sans" w:cs="Google Sans" w:eastAsia="Google Sans" w:hAnsi="Google Sans"/>
-          <w:b w:val="1"/>
-          <w:bCs w:val="1"/>
           <w:i w:val="1"/>
           <w:iCs w:val="1"/>
           <w:sz w:val="24"/>
           <w:szCs w:val="24"/>
         </w:rPr>
       </w:pPr>
-      <w:r>
-        <w:rPr>
-          <w:rFonts w:ascii="Google Sans" w:cs="Google Sans" w:eastAsia="Google Sans" w:hAnsi="Google Sans"/>
-          <w:sz w:val="24"/>
-          <w:szCs w:val="24"/>
-          <w:rtl w:val="0"/>
-        </w:rPr>
-        <w:t xml:space="preserve">Select “yes” or “no” to answer the question: </w:t>
-      </w:r>
-      <w:r>
-        <w:rPr>
-          <w:rFonts w:ascii="Google Sans" w:cs="Google Sans" w:eastAsia="Google Sans" w:hAnsi="Google Sans"/>
-          <w:i w:val="1"/>
-          <w:iCs w:val="1"/>
-          <w:sz w:val="24"/>
-          <w:szCs w:val="24"/>
-          <w:rtl w:val="0"/>
-        </w:rPr>
-        <w:t xml:space="preserve">Does Botium Toys currently adhere to this compliance best practice?</w:t>
-      </w:r>
       <w:r>
         <w:rPr>
           <w:rtl w:val="0"/>
@@ -2811,7 +2713,7 @@
               <w:widowControl w:val="0"/>
               <w:numPr>
                 <w:ilvl w:val="0"/>
-                <w:numId w:val="13"/>
+                <w:numId w:val="4"/>
               </w:numPr>
               <w:spacing w:line="240" w:lineRule="auto"/>
               <w:ind w:left="720" w:hanging="360"/>
@@ -2824,7 +2726,6 @@
             </w:pPr>
             <w:r>
               <w:rPr>
-                <w:strike w:val="1"/>
                 <w:rtl w:val="0"/>
               </w:rPr>
             </w:r>
@@ -2914,9 +2815,39 @@
           <w:p>
             <w:pPr>
               <w:widowControl w:val="0"/>
+              <w:spacing w:line="240" w:lineRule="auto"/>
+              <w:ind w:left="720" w:firstLine="0"/>
+              <w:jc w:val="both"/>
+              <w:rPr>
+                <w:rFonts w:ascii="Google Sans" w:cs="Google Sans" w:eastAsia="Google Sans" w:hAnsi="Google Sans"/>
+                <w:sz w:val="24"/>
+                <w:szCs w:val="24"/>
+              </w:rPr>
+            </w:pPr>
+            <w:r>
+              <w:rPr>
+                <w:rtl w:val="0"/>
+              </w:rPr>
+            </w:r>
+          </w:p>
+        </w:tc>
+        <w:tc>
+          <w:tcPr>
+            <w:shd w:fill="auto" w:val="clear"/>
+            <w:tcMar>
+              <w:top w:w="100.0" w:type="dxa"/>
+              <w:left w:w="100.0" w:type="dxa"/>
+              <w:bottom w:w="100.0" w:type="dxa"/>
+              <w:right w:w="100.0" w:type="dxa"/>
+            </w:tcMar>
+            <w:vAlign w:val="top"/>
+          </w:tcPr>
+          <w:p>
+            <w:pPr>
+              <w:widowControl w:val="0"/>
               <w:numPr>
                 <w:ilvl w:val="0"/>
-                <w:numId w:val="20"/>
+                <w:numId w:val="7"/>
               </w:numPr>
               <w:spacing w:line="240" w:lineRule="auto"/>
               <w:ind w:left="720" w:hanging="360"/>
@@ -2929,41 +2860,6 @@
             </w:pPr>
             <w:r>
               <w:rPr>
-                <w:rtl w:val="0"/>
-              </w:rPr>
-            </w:r>
-          </w:p>
-        </w:tc>
-        <w:tc>
-          <w:tcPr>
-            <w:shd w:fill="auto" w:val="clear"/>
-            <w:tcMar>
-              <w:top w:w="100.0" w:type="dxa"/>
-              <w:left w:w="100.0" w:type="dxa"/>
-              <w:bottom w:w="100.0" w:type="dxa"/>
-              <w:right w:w="100.0" w:type="dxa"/>
-            </w:tcMar>
-            <w:vAlign w:val="top"/>
-          </w:tcPr>
-          <w:p>
-            <w:pPr>
-              <w:widowControl w:val="0"/>
-              <w:numPr>
-                <w:ilvl w:val="0"/>
-                <w:numId w:val="19"/>
-              </w:numPr>
-              <w:spacing w:line="240" w:lineRule="auto"/>
-              <w:ind w:left="720" w:hanging="360"/>
-              <w:jc w:val="both"/>
-              <w:rPr>
-                <w:rFonts w:ascii="Google Sans" w:cs="Google Sans" w:eastAsia="Google Sans" w:hAnsi="Google Sans"/>
-                <w:sz w:val="24"/>
-                <w:szCs w:val="24"/>
-              </w:rPr>
-            </w:pPr>
-            <w:r>
-              <w:rPr>
-                <w:strike w:val="1"/>
                 <w:rtl w:val="0"/>
               </w:rPr>
             </w:r>
@@ -3057,9 +2953,39 @@
           <w:p>
             <w:pPr>
               <w:widowControl w:val="0"/>
+              <w:spacing w:line="240" w:lineRule="auto"/>
+              <w:ind w:left="720" w:firstLine="0"/>
+              <w:jc w:val="both"/>
+              <w:rPr>
+                <w:rFonts w:ascii="Google Sans" w:cs="Google Sans" w:eastAsia="Google Sans" w:hAnsi="Google Sans"/>
+                <w:sz w:val="24"/>
+                <w:szCs w:val="24"/>
+              </w:rPr>
+            </w:pPr>
+            <w:r>
+              <w:rPr>
+                <w:rtl w:val="0"/>
+              </w:rPr>
+            </w:r>
+          </w:p>
+        </w:tc>
+        <w:tc>
+          <w:tcPr>
+            <w:shd w:fill="auto" w:val="clear"/>
+            <w:tcMar>
+              <w:top w:w="100.0" w:type="dxa"/>
+              <w:left w:w="100.0" w:type="dxa"/>
+              <w:bottom w:w="100.0" w:type="dxa"/>
+              <w:right w:w="100.0" w:type="dxa"/>
+            </w:tcMar>
+            <w:vAlign w:val="top"/>
+          </w:tcPr>
+          <w:p>
+            <w:pPr>
+              <w:widowControl w:val="0"/>
               <w:numPr>
                 <w:ilvl w:val="0"/>
-                <w:numId w:val="15"/>
+                <w:numId w:val="14"/>
               </w:numPr>
               <w:spacing w:line="240" w:lineRule="auto"/>
               <w:ind w:left="720" w:hanging="360"/>
@@ -3072,41 +2998,6 @@
             </w:pPr>
             <w:r>
               <w:rPr>
-                <w:rtl w:val="0"/>
-              </w:rPr>
-            </w:r>
-          </w:p>
-        </w:tc>
-        <w:tc>
-          <w:tcPr>
-            <w:shd w:fill="auto" w:val="clear"/>
-            <w:tcMar>
-              <w:top w:w="100.0" w:type="dxa"/>
-              <w:left w:w="100.0" w:type="dxa"/>
-              <w:bottom w:w="100.0" w:type="dxa"/>
-              <w:right w:w="100.0" w:type="dxa"/>
-            </w:tcMar>
-            <w:vAlign w:val="top"/>
-          </w:tcPr>
-          <w:p>
-            <w:pPr>
-              <w:widowControl w:val="0"/>
-              <w:numPr>
-                <w:ilvl w:val="0"/>
-                <w:numId w:val="8"/>
-              </w:numPr>
-              <w:spacing w:line="240" w:lineRule="auto"/>
-              <w:ind w:left="720" w:hanging="360"/>
-              <w:jc w:val="both"/>
-              <w:rPr>
-                <w:rFonts w:ascii="Google Sans" w:cs="Google Sans" w:eastAsia="Google Sans" w:hAnsi="Google Sans"/>
-                <w:sz w:val="24"/>
-                <w:szCs w:val="24"/>
-              </w:rPr>
-            </w:pPr>
-            <w:r>
-              <w:rPr>
-                <w:strike w:val="1"/>
                 <w:rtl w:val="0"/>
               </w:rPr>
             </w:r>
@@ -3207,9 +3098,39 @@
           <w:p>
             <w:pPr>
               <w:widowControl w:val="0"/>
+              <w:spacing w:line="240" w:lineRule="auto"/>
+              <w:ind w:left="720" w:firstLine="0"/>
+              <w:jc w:val="both"/>
+              <w:rPr>
+                <w:rFonts w:ascii="Google Sans" w:cs="Google Sans" w:eastAsia="Google Sans" w:hAnsi="Google Sans"/>
+                <w:sz w:val="24"/>
+                <w:szCs w:val="24"/>
+              </w:rPr>
+            </w:pPr>
+            <w:r>
+              <w:rPr>
+                <w:rtl w:val="0"/>
+              </w:rPr>
+            </w:r>
+          </w:p>
+        </w:tc>
+        <w:tc>
+          <w:tcPr>
+            <w:shd w:fill="auto" w:val="clear"/>
+            <w:tcMar>
+              <w:top w:w="100.0" w:type="dxa"/>
+              <w:left w:w="100.0" w:type="dxa"/>
+              <w:bottom w:w="100.0" w:type="dxa"/>
+              <w:right w:w="100.0" w:type="dxa"/>
+            </w:tcMar>
+            <w:vAlign w:val="top"/>
+          </w:tcPr>
+          <w:p>
+            <w:pPr>
+              <w:widowControl w:val="0"/>
               <w:numPr>
                 <w:ilvl w:val="0"/>
-                <w:numId w:val="2"/>
+                <w:numId w:val="3"/>
               </w:numPr>
               <w:spacing w:line="240" w:lineRule="auto"/>
               <w:ind w:left="720" w:hanging="360"/>
@@ -3222,41 +3143,6 @@
             </w:pPr>
             <w:r>
               <w:rPr>
-                <w:rtl w:val="0"/>
-              </w:rPr>
-            </w:r>
-          </w:p>
-        </w:tc>
-        <w:tc>
-          <w:tcPr>
-            <w:shd w:fill="auto" w:val="clear"/>
-            <w:tcMar>
-              <w:top w:w="100.0" w:type="dxa"/>
-              <w:left w:w="100.0" w:type="dxa"/>
-              <w:bottom w:w="100.0" w:type="dxa"/>
-              <w:right w:w="100.0" w:type="dxa"/>
-            </w:tcMar>
-            <w:vAlign w:val="top"/>
-          </w:tcPr>
-          <w:p>
-            <w:pPr>
-              <w:widowControl w:val="0"/>
-              <w:numPr>
-                <w:ilvl w:val="0"/>
-                <w:numId w:val="12"/>
-              </w:numPr>
-              <w:spacing w:line="240" w:lineRule="auto"/>
-              <w:ind w:left="720" w:hanging="360"/>
-              <w:jc w:val="both"/>
-              <w:rPr>
-                <w:rFonts w:ascii="Google Sans" w:cs="Google Sans" w:eastAsia="Google Sans" w:hAnsi="Google Sans"/>
-                <w:sz w:val="24"/>
-                <w:szCs w:val="24"/>
-              </w:rPr>
-            </w:pPr>
-            <w:r>
-              <w:rPr>
-                <w:strike w:val="1"/>
                 <w:rtl w:val="0"/>
               </w:rPr>
             </w:r>
@@ -3625,7 +3511,7 @@
               <w:widowControl w:val="0"/>
               <w:numPr>
                 <w:ilvl w:val="0"/>
-                <w:numId w:val="13"/>
+                <w:numId w:val="4"/>
               </w:numPr>
               <w:spacing w:line="240" w:lineRule="auto"/>
               <w:ind w:left="720" w:hanging="360"/>
@@ -3638,7 +3524,6 @@
             </w:pPr>
             <w:r>
               <w:rPr>
-                <w:strike w:val="1"/>
                 <w:rtl w:val="0"/>
               </w:rPr>
             </w:r>
@@ -3732,7 +3617,7 @@
               <w:widowControl w:val="0"/>
               <w:numPr>
                 <w:ilvl w:val="0"/>
-                <w:numId w:val="20"/>
+                <w:numId w:val="9"/>
               </w:numPr>
               <w:spacing w:line="240" w:lineRule="auto"/>
               <w:ind w:left="720" w:hanging="360"/>
@@ -3745,32 +3630,27 @@
             </w:pPr>
             <w:r>
               <w:rPr>
-                <w:strike w:val="1"/>
-                <w:rtl w:val="0"/>
-              </w:rPr>
-            </w:r>
-          </w:p>
-        </w:tc>
-        <w:tc>
-          <w:tcPr>
-            <w:shd w:fill="auto" w:val="clear"/>
-            <w:tcMar>
-              <w:top w:w="100.0" w:type="dxa"/>
-              <w:left w:w="100.0" w:type="dxa"/>
-              <w:bottom w:w="100.0" w:type="dxa"/>
-              <w:right w:w="100.0" w:type="dxa"/>
-            </w:tcMar>
-            <w:vAlign w:val="top"/>
-          </w:tcPr>
-          <w:p>
-            <w:pPr>
-              <w:widowControl w:val="0"/>
-              <w:numPr>
-                <w:ilvl w:val="0"/>
-                <w:numId w:val="19"/>
-              </w:numPr>
-              <w:spacing w:line="240" w:lineRule="auto"/>
-              <w:ind w:left="720" w:hanging="360"/>
+                <w:rtl w:val="0"/>
+              </w:rPr>
+            </w:r>
+          </w:p>
+        </w:tc>
+        <w:tc>
+          <w:tcPr>
+            <w:shd w:fill="auto" w:val="clear"/>
+            <w:tcMar>
+              <w:top w:w="100.0" w:type="dxa"/>
+              <w:left w:w="100.0" w:type="dxa"/>
+              <w:bottom w:w="100.0" w:type="dxa"/>
+              <w:right w:w="100.0" w:type="dxa"/>
+            </w:tcMar>
+            <w:vAlign w:val="top"/>
+          </w:tcPr>
+          <w:p>
+            <w:pPr>
+              <w:widowControl w:val="0"/>
+              <w:spacing w:line="240" w:lineRule="auto"/>
+              <w:ind w:left="720" w:firstLine="0"/>
               <w:jc w:val="both"/>
               <w:rPr>
                 <w:rFonts w:ascii="Google Sans" w:cs="Google Sans" w:eastAsia="Google Sans" w:hAnsi="Google Sans"/>
@@ -3873,9 +3753,39 @@
           <w:p>
             <w:pPr>
               <w:widowControl w:val="0"/>
+              <w:spacing w:line="240" w:lineRule="auto"/>
+              <w:ind w:left="720" w:firstLine="0"/>
+              <w:jc w:val="both"/>
+              <w:rPr>
+                <w:rFonts w:ascii="Google Sans" w:cs="Google Sans" w:eastAsia="Google Sans" w:hAnsi="Google Sans"/>
+                <w:sz w:val="24"/>
+                <w:szCs w:val="24"/>
+              </w:rPr>
+            </w:pPr>
+            <w:r>
+              <w:rPr>
+                <w:rtl w:val="0"/>
+              </w:rPr>
+            </w:r>
+          </w:p>
+        </w:tc>
+        <w:tc>
+          <w:tcPr>
+            <w:shd w:fill="auto" w:val="clear"/>
+            <w:tcMar>
+              <w:top w:w="100.0" w:type="dxa"/>
+              <w:left w:w="100.0" w:type="dxa"/>
+              <w:bottom w:w="100.0" w:type="dxa"/>
+              <w:right w:w="100.0" w:type="dxa"/>
+            </w:tcMar>
+            <w:vAlign w:val="top"/>
+          </w:tcPr>
+          <w:p>
+            <w:pPr>
+              <w:widowControl w:val="0"/>
               <w:numPr>
                 <w:ilvl w:val="0"/>
-                <w:numId w:val="15"/>
+                <w:numId w:val="14"/>
               </w:numPr>
               <w:spacing w:line="240" w:lineRule="auto"/>
               <w:ind w:left="720" w:hanging="360"/>
@@ -3888,41 +3798,6 @@
             </w:pPr>
             <w:r>
               <w:rPr>
-                <w:rtl w:val="0"/>
-              </w:rPr>
-            </w:r>
-          </w:p>
-        </w:tc>
-        <w:tc>
-          <w:tcPr>
-            <w:shd w:fill="auto" w:val="clear"/>
-            <w:tcMar>
-              <w:top w:w="100.0" w:type="dxa"/>
-              <w:left w:w="100.0" w:type="dxa"/>
-              <w:bottom w:w="100.0" w:type="dxa"/>
-              <w:right w:w="100.0" w:type="dxa"/>
-            </w:tcMar>
-            <w:vAlign w:val="top"/>
-          </w:tcPr>
-          <w:p>
-            <w:pPr>
-              <w:widowControl w:val="0"/>
-              <w:numPr>
-                <w:ilvl w:val="0"/>
-                <w:numId w:val="8"/>
-              </w:numPr>
-              <w:spacing w:line="240" w:lineRule="auto"/>
-              <w:ind w:left="720" w:hanging="360"/>
-              <w:jc w:val="both"/>
-              <w:rPr>
-                <w:rFonts w:ascii="Google Sans" w:cs="Google Sans" w:eastAsia="Google Sans" w:hAnsi="Google Sans"/>
-                <w:sz w:val="24"/>
-                <w:szCs w:val="24"/>
-              </w:rPr>
-            </w:pPr>
-            <w:r>
-              <w:rPr>
-                <w:strike w:val="1"/>
                 <w:rtl w:val="0"/>
               </w:rPr>
             </w:r>
@@ -4018,7 +3893,7 @@
               <w:widowControl w:val="0"/>
               <w:numPr>
                 <w:ilvl w:val="0"/>
-                <w:numId w:val="2"/>
+                <w:numId w:val="8"/>
               </w:numPr>
               <w:spacing w:line="240" w:lineRule="auto"/>
               <w:ind w:left="720" w:hanging="360"/>
@@ -4031,32 +3906,27 @@
             </w:pPr>
             <w:r>
               <w:rPr>
-                <w:strike w:val="1"/>
-                <w:rtl w:val="0"/>
-              </w:rPr>
-            </w:r>
-          </w:p>
-        </w:tc>
-        <w:tc>
-          <w:tcPr>
-            <w:shd w:fill="auto" w:val="clear"/>
-            <w:tcMar>
-              <w:top w:w="100.0" w:type="dxa"/>
-              <w:left w:w="100.0" w:type="dxa"/>
-              <w:bottom w:w="100.0" w:type="dxa"/>
-              <w:right w:w="100.0" w:type="dxa"/>
-            </w:tcMar>
-            <w:vAlign w:val="top"/>
-          </w:tcPr>
-          <w:p>
-            <w:pPr>
-              <w:widowControl w:val="0"/>
-              <w:numPr>
-                <w:ilvl w:val="0"/>
-                <w:numId w:val="12"/>
-              </w:numPr>
-              <w:spacing w:line="240" w:lineRule="auto"/>
-              <w:ind w:left="720" w:hanging="360"/>
+                <w:rtl w:val="0"/>
+              </w:rPr>
+            </w:r>
+          </w:p>
+        </w:tc>
+        <w:tc>
+          <w:tcPr>
+            <w:shd w:fill="auto" w:val="clear"/>
+            <w:tcMar>
+              <w:top w:w="100.0" w:type="dxa"/>
+              <w:left w:w="100.0" w:type="dxa"/>
+              <w:bottom w:w="100.0" w:type="dxa"/>
+              <w:right w:w="100.0" w:type="dxa"/>
+            </w:tcMar>
+            <w:vAlign w:val="top"/>
+          </w:tcPr>
+          <w:p>
+            <w:pPr>
+              <w:widowControl w:val="0"/>
+              <w:spacing w:line="240" w:lineRule="auto"/>
+              <w:ind w:left="720" w:firstLine="0"/>
               <w:jc w:val="both"/>
               <w:rPr>
                 <w:rFonts w:ascii="Google Sans" w:cs="Google Sans" w:eastAsia="Google Sans" w:hAnsi="Google Sans"/>
@@ -4442,7 +4312,7 @@
               <w:widowControl w:val="0"/>
               <w:numPr>
                 <w:ilvl w:val="0"/>
-                <w:numId w:val="13"/>
+                <w:numId w:val="4"/>
               </w:numPr>
               <w:spacing w:line="240" w:lineRule="auto"/>
               <w:ind w:left="720" w:hanging="360"/>
@@ -4455,7 +4325,6 @@
             </w:pPr>
             <w:r>
               <w:rPr>
-                <w:strike w:val="1"/>
                 <w:rtl w:val="0"/>
               </w:rPr>
             </w:r>
@@ -4545,9 +4414,39 @@
           <w:p>
             <w:pPr>
               <w:widowControl w:val="0"/>
+              <w:spacing w:line="240" w:lineRule="auto"/>
+              <w:ind w:left="720" w:firstLine="0"/>
+              <w:jc w:val="both"/>
+              <w:rPr>
+                <w:rFonts w:ascii="Google Sans" w:cs="Google Sans" w:eastAsia="Google Sans" w:hAnsi="Google Sans"/>
+                <w:sz w:val="24"/>
+                <w:szCs w:val="24"/>
+              </w:rPr>
+            </w:pPr>
+            <w:r>
+              <w:rPr>
+                <w:rtl w:val="0"/>
+              </w:rPr>
+            </w:r>
+          </w:p>
+        </w:tc>
+        <w:tc>
+          <w:tcPr>
+            <w:shd w:fill="auto" w:val="clear"/>
+            <w:tcMar>
+              <w:top w:w="100.0" w:type="dxa"/>
+              <w:left w:w="100.0" w:type="dxa"/>
+              <w:bottom w:w="100.0" w:type="dxa"/>
+              <w:right w:w="100.0" w:type="dxa"/>
+            </w:tcMar>
+            <w:vAlign w:val="top"/>
+          </w:tcPr>
+          <w:p>
+            <w:pPr>
+              <w:widowControl w:val="0"/>
               <w:numPr>
                 <w:ilvl w:val="0"/>
-                <w:numId w:val="20"/>
+                <w:numId w:val="7"/>
               </w:numPr>
               <w:spacing w:line="240" w:lineRule="auto"/>
               <w:ind w:left="720" w:hanging="360"/>
@@ -4560,41 +4459,6 @@
             </w:pPr>
             <w:r>
               <w:rPr>
-                <w:rtl w:val="0"/>
-              </w:rPr>
-            </w:r>
-          </w:p>
-        </w:tc>
-        <w:tc>
-          <w:tcPr>
-            <w:shd w:fill="auto" w:val="clear"/>
-            <w:tcMar>
-              <w:top w:w="100.0" w:type="dxa"/>
-              <w:left w:w="100.0" w:type="dxa"/>
-              <w:bottom w:w="100.0" w:type="dxa"/>
-              <w:right w:w="100.0" w:type="dxa"/>
-            </w:tcMar>
-            <w:vAlign w:val="top"/>
-          </w:tcPr>
-          <w:p>
-            <w:pPr>
-              <w:widowControl w:val="0"/>
-              <w:numPr>
-                <w:ilvl w:val="0"/>
-                <w:numId w:val="19"/>
-              </w:numPr>
-              <w:spacing w:line="240" w:lineRule="auto"/>
-              <w:ind w:left="720" w:hanging="360"/>
-              <w:jc w:val="both"/>
-              <w:rPr>
-                <w:rFonts w:ascii="Google Sans" w:cs="Google Sans" w:eastAsia="Google Sans" w:hAnsi="Google Sans"/>
-                <w:sz w:val="24"/>
-                <w:szCs w:val="24"/>
-              </w:rPr>
-            </w:pPr>
-            <w:r>
-              <w:rPr>
-                <w:strike w:val="1"/>
                 <w:rtl w:val="0"/>
               </w:rPr>
             </w:r>
@@ -4690,7 +4554,7 @@
               <w:widowControl w:val="0"/>
               <w:numPr>
                 <w:ilvl w:val="0"/>
-                <w:numId w:val="15"/>
+                <w:numId w:val="6"/>
               </w:numPr>
               <w:spacing w:line="240" w:lineRule="auto"/>
               <w:ind w:left="720" w:hanging="360"/>
@@ -4703,32 +4567,27 @@
             </w:pPr>
             <w:r>
               <w:rPr>
-                <w:strike w:val="1"/>
-                <w:rtl w:val="0"/>
-              </w:rPr>
-            </w:r>
-          </w:p>
-        </w:tc>
-        <w:tc>
-          <w:tcPr>
-            <w:shd w:fill="auto" w:val="clear"/>
-            <w:tcMar>
-              <w:top w:w="100.0" w:type="dxa"/>
-              <w:left w:w="100.0" w:type="dxa"/>
-              <w:bottom w:w="100.0" w:type="dxa"/>
-              <w:right w:w="100.0" w:type="dxa"/>
-            </w:tcMar>
-            <w:vAlign w:val="top"/>
-          </w:tcPr>
-          <w:p>
-            <w:pPr>
-              <w:widowControl w:val="0"/>
-              <w:numPr>
-                <w:ilvl w:val="0"/>
-                <w:numId w:val="8"/>
-              </w:numPr>
-              <w:spacing w:line="240" w:lineRule="auto"/>
-              <w:ind w:left="720" w:hanging="360"/>
+                <w:rtl w:val="0"/>
+              </w:rPr>
+            </w:r>
+          </w:p>
+        </w:tc>
+        <w:tc>
+          <w:tcPr>
+            <w:shd w:fill="auto" w:val="clear"/>
+            <w:tcMar>
+              <w:top w:w="100.0" w:type="dxa"/>
+              <w:left w:w="100.0" w:type="dxa"/>
+              <w:bottom w:w="100.0" w:type="dxa"/>
+              <w:right w:w="100.0" w:type="dxa"/>
+            </w:tcMar>
+            <w:vAlign w:val="top"/>
+          </w:tcPr>
+          <w:p>
+            <w:pPr>
+              <w:widowControl w:val="0"/>
+              <w:spacing w:line="240" w:lineRule="auto"/>
+              <w:ind w:left="720" w:firstLine="0"/>
               <w:jc w:val="both"/>
               <w:rPr>
                 <w:rFonts w:ascii="Google Sans" w:cs="Google Sans" w:eastAsia="Google Sans" w:hAnsi="Google Sans"/>
@@ -4831,9 +4690,39 @@
           <w:p>
             <w:pPr>
               <w:widowControl w:val="0"/>
+              <w:spacing w:line="240" w:lineRule="auto"/>
+              <w:ind w:left="720" w:firstLine="0"/>
+              <w:jc w:val="both"/>
+              <w:rPr>
+                <w:rFonts w:ascii="Google Sans" w:cs="Google Sans" w:eastAsia="Google Sans" w:hAnsi="Google Sans"/>
+                <w:sz w:val="24"/>
+                <w:szCs w:val="24"/>
+              </w:rPr>
+            </w:pPr>
+            <w:r>
+              <w:rPr>
+                <w:rtl w:val="0"/>
+              </w:rPr>
+            </w:r>
+          </w:p>
+        </w:tc>
+        <w:tc>
+          <w:tcPr>
+            <w:shd w:fill="auto" w:val="clear"/>
+            <w:tcMar>
+              <w:top w:w="100.0" w:type="dxa"/>
+              <w:left w:w="100.0" w:type="dxa"/>
+              <w:bottom w:w="100.0" w:type="dxa"/>
+              <w:right w:w="100.0" w:type="dxa"/>
+            </w:tcMar>
+            <w:vAlign w:val="top"/>
+          </w:tcPr>
+          <w:p>
+            <w:pPr>
+              <w:widowControl w:val="0"/>
               <w:numPr>
                 <w:ilvl w:val="0"/>
-                <w:numId w:val="2"/>
+                <w:numId w:val="3"/>
               </w:numPr>
               <w:spacing w:line="240" w:lineRule="auto"/>
               <w:ind w:left="720" w:hanging="360"/>
@@ -4846,41 +4735,6 @@
             </w:pPr>
             <w:r>
               <w:rPr>
-                <w:rtl w:val="0"/>
-              </w:rPr>
-            </w:r>
-          </w:p>
-        </w:tc>
-        <w:tc>
-          <w:tcPr>
-            <w:shd w:fill="auto" w:val="clear"/>
-            <w:tcMar>
-              <w:top w:w="100.0" w:type="dxa"/>
-              <w:left w:w="100.0" w:type="dxa"/>
-              <w:bottom w:w="100.0" w:type="dxa"/>
-              <w:right w:w="100.0" w:type="dxa"/>
-            </w:tcMar>
-            <w:vAlign w:val="top"/>
-          </w:tcPr>
-          <w:p>
-            <w:pPr>
-              <w:widowControl w:val="0"/>
-              <w:numPr>
-                <w:ilvl w:val="0"/>
-                <w:numId w:val="12"/>
-              </w:numPr>
-              <w:spacing w:line="240" w:lineRule="auto"/>
-              <w:ind w:left="720" w:hanging="360"/>
-              <w:jc w:val="both"/>
-              <w:rPr>
-                <w:rFonts w:ascii="Google Sans" w:cs="Google Sans" w:eastAsia="Google Sans" w:hAnsi="Google Sans"/>
-                <w:sz w:val="24"/>
-                <w:szCs w:val="24"/>
-              </w:rPr>
-            </w:pPr>
-            <w:r>
-              <w:rPr>
-                <w:strike w:val="1"/>
                 <w:rtl w:val="0"/>
               </w:rPr>
             </w:r>
@@ -5039,11 +4893,6 @@
         </w:rPr>
         <w:t xml:space="preserve">Botium toys need to ensure data confidentiality by using encryption and the principle of authorization. Moreover, the compliance needs a lot of improvements like employee should be able to access the least amount of data that is required for his job to ensure data safety.</w:t>
       </w:r>
-      <w:r>
-        <w:rPr>
-          <w:rtl w:val="0"/>
-        </w:rPr>
-      </w:r>
     </w:p>
     <w:p>
       <w:pPr>
@@ -6497,666 +6346,6 @@
     </w:lvl>
   </w:abstractNum>
   <w:abstractNum w:abstractNumId="14">
-    <w:lvl w:ilvl="0">
-      <w:start w:val="1"/>
-      <w:numFmt w:val="bullet"/>
-      <w:lvlText w:val="●"/>
-      <w:lvlJc w:val="left"/>
-      <w:pPr>
-        <w:ind w:left="720" w:hanging="360"/>
-      </w:pPr>
-      <w:rPr>
-        <w:u w:val="none"/>
-      </w:rPr>
-    </w:lvl>
-    <w:lvl w:ilvl="1">
-      <w:start w:val="1"/>
-      <w:numFmt w:val="bullet"/>
-      <w:lvlText w:val="●"/>
-      <w:lvlJc w:val="left"/>
-      <w:pPr>
-        <w:ind w:left="1440" w:hanging="360"/>
-      </w:pPr>
-      <w:rPr>
-        <w:u w:val="none"/>
-      </w:rPr>
-    </w:lvl>
-    <w:lvl w:ilvl="2">
-      <w:start w:val="1"/>
-      <w:numFmt w:val="bullet"/>
-      <w:lvlText w:val="●"/>
-      <w:lvlJc w:val="left"/>
-      <w:pPr>
-        <w:ind w:left="2160" w:hanging="360"/>
-      </w:pPr>
-      <w:rPr>
-        <w:u w:val="none"/>
-      </w:rPr>
-    </w:lvl>
-    <w:lvl w:ilvl="3">
-      <w:start w:val="1"/>
-      <w:numFmt w:val="bullet"/>
-      <w:lvlText w:val="●"/>
-      <w:lvlJc w:val="left"/>
-      <w:pPr>
-        <w:ind w:left="2880" w:hanging="360"/>
-      </w:pPr>
-      <w:rPr>
-        <w:u w:val="none"/>
-      </w:rPr>
-    </w:lvl>
-    <w:lvl w:ilvl="4">
-      <w:start w:val="1"/>
-      <w:numFmt w:val="bullet"/>
-      <w:lvlText w:val="●"/>
-      <w:lvlJc w:val="left"/>
-      <w:pPr>
-        <w:ind w:left="3600" w:hanging="360"/>
-      </w:pPr>
-      <w:rPr>
-        <w:u w:val="none"/>
-      </w:rPr>
-    </w:lvl>
-    <w:lvl w:ilvl="5">
-      <w:start w:val="1"/>
-      <w:numFmt w:val="bullet"/>
-      <w:lvlText w:val="●"/>
-      <w:lvlJc w:val="left"/>
-      <w:pPr>
-        <w:ind w:left="4320" w:hanging="360"/>
-      </w:pPr>
-      <w:rPr>
-        <w:u w:val="none"/>
-      </w:rPr>
-    </w:lvl>
-    <w:lvl w:ilvl="6">
-      <w:start w:val="1"/>
-      <w:numFmt w:val="bullet"/>
-      <w:lvlText w:val="●"/>
-      <w:lvlJc w:val="left"/>
-      <w:pPr>
-        <w:ind w:left="5040" w:hanging="360"/>
-      </w:pPr>
-      <w:rPr>
-        <w:u w:val="none"/>
-      </w:rPr>
-    </w:lvl>
-    <w:lvl w:ilvl="7">
-      <w:start w:val="1"/>
-      <w:numFmt w:val="bullet"/>
-      <w:lvlText w:val="●"/>
-      <w:lvlJc w:val="left"/>
-      <w:pPr>
-        <w:ind w:left="5760" w:hanging="360"/>
-      </w:pPr>
-      <w:rPr>
-        <w:u w:val="none"/>
-      </w:rPr>
-    </w:lvl>
-    <w:lvl w:ilvl="8">
-      <w:start w:val="1"/>
-      <w:numFmt w:val="bullet"/>
-      <w:lvlText w:val="●"/>
-      <w:lvlJc w:val="left"/>
-      <w:pPr>
-        <w:ind w:left="6480" w:hanging="360"/>
-      </w:pPr>
-      <w:rPr>
-        <w:u w:val="none"/>
-      </w:rPr>
-    </w:lvl>
-  </w:abstractNum>
-  <w:abstractNum w:abstractNumId="15">
-    <w:lvl w:ilvl="0">
-      <w:start w:val="1"/>
-      <w:numFmt w:val="bullet"/>
-      <w:lvlText w:val="●"/>
-      <w:lvlJc w:val="left"/>
-      <w:pPr>
-        <w:ind w:left="720" w:hanging="360"/>
-      </w:pPr>
-      <w:rPr>
-        <w:u w:val="none"/>
-      </w:rPr>
-    </w:lvl>
-    <w:lvl w:ilvl="1">
-      <w:start w:val="1"/>
-      <w:numFmt w:val="bullet"/>
-      <w:lvlText w:val="●"/>
-      <w:lvlJc w:val="left"/>
-      <w:pPr>
-        <w:ind w:left="1440" w:hanging="360"/>
-      </w:pPr>
-      <w:rPr>
-        <w:u w:val="none"/>
-      </w:rPr>
-    </w:lvl>
-    <w:lvl w:ilvl="2">
-      <w:start w:val="1"/>
-      <w:numFmt w:val="bullet"/>
-      <w:lvlText w:val="●"/>
-      <w:lvlJc w:val="left"/>
-      <w:pPr>
-        <w:ind w:left="2160" w:hanging="360"/>
-      </w:pPr>
-      <w:rPr>
-        <w:u w:val="none"/>
-      </w:rPr>
-    </w:lvl>
-    <w:lvl w:ilvl="3">
-      <w:start w:val="1"/>
-      <w:numFmt w:val="bullet"/>
-      <w:lvlText w:val="●"/>
-      <w:lvlJc w:val="left"/>
-      <w:pPr>
-        <w:ind w:left="2880" w:hanging="360"/>
-      </w:pPr>
-      <w:rPr>
-        <w:u w:val="none"/>
-      </w:rPr>
-    </w:lvl>
-    <w:lvl w:ilvl="4">
-      <w:start w:val="1"/>
-      <w:numFmt w:val="bullet"/>
-      <w:lvlText w:val="●"/>
-      <w:lvlJc w:val="left"/>
-      <w:pPr>
-        <w:ind w:left="3600" w:hanging="360"/>
-      </w:pPr>
-      <w:rPr>
-        <w:u w:val="none"/>
-      </w:rPr>
-    </w:lvl>
-    <w:lvl w:ilvl="5">
-      <w:start w:val="1"/>
-      <w:numFmt w:val="bullet"/>
-      <w:lvlText w:val="●"/>
-      <w:lvlJc w:val="left"/>
-      <w:pPr>
-        <w:ind w:left="4320" w:hanging="360"/>
-      </w:pPr>
-      <w:rPr>
-        <w:u w:val="none"/>
-      </w:rPr>
-    </w:lvl>
-    <w:lvl w:ilvl="6">
-      <w:start w:val="1"/>
-      <w:numFmt w:val="bullet"/>
-      <w:lvlText w:val="●"/>
-      <w:lvlJc w:val="left"/>
-      <w:pPr>
-        <w:ind w:left="5040" w:hanging="360"/>
-      </w:pPr>
-      <w:rPr>
-        <w:u w:val="none"/>
-      </w:rPr>
-    </w:lvl>
-    <w:lvl w:ilvl="7">
-      <w:start w:val="1"/>
-      <w:numFmt w:val="bullet"/>
-      <w:lvlText w:val="●"/>
-      <w:lvlJc w:val="left"/>
-      <w:pPr>
-        <w:ind w:left="5760" w:hanging="360"/>
-      </w:pPr>
-      <w:rPr>
-        <w:u w:val="none"/>
-      </w:rPr>
-    </w:lvl>
-    <w:lvl w:ilvl="8">
-      <w:start w:val="1"/>
-      <w:numFmt w:val="bullet"/>
-      <w:lvlText w:val="●"/>
-      <w:lvlJc w:val="left"/>
-      <w:pPr>
-        <w:ind w:left="6480" w:hanging="360"/>
-      </w:pPr>
-      <w:rPr>
-        <w:u w:val="none"/>
-      </w:rPr>
-    </w:lvl>
-  </w:abstractNum>
-  <w:abstractNum w:abstractNumId="16">
-    <w:lvl w:ilvl="0">
-      <w:start w:val="1"/>
-      <w:numFmt w:val="bullet"/>
-      <w:lvlText w:val="●"/>
-      <w:lvlJc w:val="left"/>
-      <w:pPr>
-        <w:ind w:left="720" w:hanging="360"/>
-      </w:pPr>
-      <w:rPr>
-        <w:u w:val="none"/>
-      </w:rPr>
-    </w:lvl>
-    <w:lvl w:ilvl="1">
-      <w:start w:val="1"/>
-      <w:numFmt w:val="bullet"/>
-      <w:lvlText w:val="●"/>
-      <w:lvlJc w:val="left"/>
-      <w:pPr>
-        <w:ind w:left="1440" w:hanging="360"/>
-      </w:pPr>
-      <w:rPr>
-        <w:u w:val="none"/>
-      </w:rPr>
-    </w:lvl>
-    <w:lvl w:ilvl="2">
-      <w:start w:val="1"/>
-      <w:numFmt w:val="bullet"/>
-      <w:lvlText w:val="●"/>
-      <w:lvlJc w:val="left"/>
-      <w:pPr>
-        <w:ind w:left="2160" w:hanging="360"/>
-      </w:pPr>
-      <w:rPr>
-        <w:u w:val="none"/>
-      </w:rPr>
-    </w:lvl>
-    <w:lvl w:ilvl="3">
-      <w:start w:val="1"/>
-      <w:numFmt w:val="bullet"/>
-      <w:lvlText w:val="●"/>
-      <w:lvlJc w:val="left"/>
-      <w:pPr>
-        <w:ind w:left="2880" w:hanging="360"/>
-      </w:pPr>
-      <w:rPr>
-        <w:u w:val="none"/>
-      </w:rPr>
-    </w:lvl>
-    <w:lvl w:ilvl="4">
-      <w:start w:val="1"/>
-      <w:numFmt w:val="bullet"/>
-      <w:lvlText w:val="●"/>
-      <w:lvlJc w:val="left"/>
-      <w:pPr>
-        <w:ind w:left="3600" w:hanging="360"/>
-      </w:pPr>
-      <w:rPr>
-        <w:u w:val="none"/>
-      </w:rPr>
-    </w:lvl>
-    <w:lvl w:ilvl="5">
-      <w:start w:val="1"/>
-      <w:numFmt w:val="bullet"/>
-      <w:lvlText w:val="●"/>
-      <w:lvlJc w:val="left"/>
-      <w:pPr>
-        <w:ind w:left="4320" w:hanging="360"/>
-      </w:pPr>
-      <w:rPr>
-        <w:u w:val="none"/>
-      </w:rPr>
-    </w:lvl>
-    <w:lvl w:ilvl="6">
-      <w:start w:val="1"/>
-      <w:numFmt w:val="bullet"/>
-      <w:lvlText w:val="●"/>
-      <w:lvlJc w:val="left"/>
-      <w:pPr>
-        <w:ind w:left="5040" w:hanging="360"/>
-      </w:pPr>
-      <w:rPr>
-        <w:u w:val="none"/>
-      </w:rPr>
-    </w:lvl>
-    <w:lvl w:ilvl="7">
-      <w:start w:val="1"/>
-      <w:numFmt w:val="bullet"/>
-      <w:lvlText w:val="●"/>
-      <w:lvlJc w:val="left"/>
-      <w:pPr>
-        <w:ind w:left="5760" w:hanging="360"/>
-      </w:pPr>
-      <w:rPr>
-        <w:u w:val="none"/>
-      </w:rPr>
-    </w:lvl>
-    <w:lvl w:ilvl="8">
-      <w:start w:val="1"/>
-      <w:numFmt w:val="bullet"/>
-      <w:lvlText w:val="●"/>
-      <w:lvlJc w:val="left"/>
-      <w:pPr>
-        <w:ind w:left="6480" w:hanging="360"/>
-      </w:pPr>
-      <w:rPr>
-        <w:u w:val="none"/>
-      </w:rPr>
-    </w:lvl>
-  </w:abstractNum>
-  <w:abstractNum w:abstractNumId="17">
-    <w:lvl w:ilvl="0">
-      <w:start w:val="1"/>
-      <w:numFmt w:val="bullet"/>
-      <w:lvlText w:val="●"/>
-      <w:lvlJc w:val="left"/>
-      <w:pPr>
-        <w:ind w:left="720" w:hanging="360"/>
-      </w:pPr>
-      <w:rPr>
-        <w:u w:val="none"/>
-      </w:rPr>
-    </w:lvl>
-    <w:lvl w:ilvl="1">
-      <w:start w:val="1"/>
-      <w:numFmt w:val="bullet"/>
-      <w:lvlText w:val="●"/>
-      <w:lvlJc w:val="left"/>
-      <w:pPr>
-        <w:ind w:left="1440" w:hanging="360"/>
-      </w:pPr>
-      <w:rPr>
-        <w:u w:val="none"/>
-      </w:rPr>
-    </w:lvl>
-    <w:lvl w:ilvl="2">
-      <w:start w:val="1"/>
-      <w:numFmt w:val="bullet"/>
-      <w:lvlText w:val="●"/>
-      <w:lvlJc w:val="left"/>
-      <w:pPr>
-        <w:ind w:left="2160" w:hanging="360"/>
-      </w:pPr>
-      <w:rPr>
-        <w:u w:val="none"/>
-      </w:rPr>
-    </w:lvl>
-    <w:lvl w:ilvl="3">
-      <w:start w:val="1"/>
-      <w:numFmt w:val="bullet"/>
-      <w:lvlText w:val="●"/>
-      <w:lvlJc w:val="left"/>
-      <w:pPr>
-        <w:ind w:left="2880" w:hanging="360"/>
-      </w:pPr>
-      <w:rPr>
-        <w:u w:val="none"/>
-      </w:rPr>
-    </w:lvl>
-    <w:lvl w:ilvl="4">
-      <w:start w:val="1"/>
-      <w:numFmt w:val="bullet"/>
-      <w:lvlText w:val="●"/>
-      <w:lvlJc w:val="left"/>
-      <w:pPr>
-        <w:ind w:left="3600" w:hanging="360"/>
-      </w:pPr>
-      <w:rPr>
-        <w:u w:val="none"/>
-      </w:rPr>
-    </w:lvl>
-    <w:lvl w:ilvl="5">
-      <w:start w:val="1"/>
-      <w:numFmt w:val="bullet"/>
-      <w:lvlText w:val="●"/>
-      <w:lvlJc w:val="left"/>
-      <w:pPr>
-        <w:ind w:left="4320" w:hanging="360"/>
-      </w:pPr>
-      <w:rPr>
-        <w:u w:val="none"/>
-      </w:rPr>
-    </w:lvl>
-    <w:lvl w:ilvl="6">
-      <w:start w:val="1"/>
-      <w:numFmt w:val="bullet"/>
-      <w:lvlText w:val="●"/>
-      <w:lvlJc w:val="left"/>
-      <w:pPr>
-        <w:ind w:left="5040" w:hanging="360"/>
-      </w:pPr>
-      <w:rPr>
-        <w:u w:val="none"/>
-      </w:rPr>
-    </w:lvl>
-    <w:lvl w:ilvl="7">
-      <w:start w:val="1"/>
-      <w:numFmt w:val="bullet"/>
-      <w:lvlText w:val="●"/>
-      <w:lvlJc w:val="left"/>
-      <w:pPr>
-        <w:ind w:left="5760" w:hanging="360"/>
-      </w:pPr>
-      <w:rPr>
-        <w:u w:val="none"/>
-      </w:rPr>
-    </w:lvl>
-    <w:lvl w:ilvl="8">
-      <w:start w:val="1"/>
-      <w:numFmt w:val="bullet"/>
-      <w:lvlText w:val="●"/>
-      <w:lvlJc w:val="left"/>
-      <w:pPr>
-        <w:ind w:left="6480" w:hanging="360"/>
-      </w:pPr>
-      <w:rPr>
-        <w:u w:val="none"/>
-      </w:rPr>
-    </w:lvl>
-  </w:abstractNum>
-  <w:abstractNum w:abstractNumId="18">
-    <w:lvl w:ilvl="0">
-      <w:start w:val="1"/>
-      <w:numFmt w:val="bullet"/>
-      <w:lvlText w:val="●"/>
-      <w:lvlJc w:val="left"/>
-      <w:pPr>
-        <w:ind w:left="720" w:hanging="360"/>
-      </w:pPr>
-      <w:rPr>
-        <w:u w:val="none"/>
-      </w:rPr>
-    </w:lvl>
-    <w:lvl w:ilvl="1">
-      <w:start w:val="1"/>
-      <w:numFmt w:val="bullet"/>
-      <w:lvlText w:val="●"/>
-      <w:lvlJc w:val="left"/>
-      <w:pPr>
-        <w:ind w:left="1440" w:hanging="360"/>
-      </w:pPr>
-      <w:rPr>
-        <w:u w:val="none"/>
-      </w:rPr>
-    </w:lvl>
-    <w:lvl w:ilvl="2">
-      <w:start w:val="1"/>
-      <w:numFmt w:val="bullet"/>
-      <w:lvlText w:val="●"/>
-      <w:lvlJc w:val="left"/>
-      <w:pPr>
-        <w:ind w:left="2160" w:hanging="360"/>
-      </w:pPr>
-      <w:rPr>
-        <w:u w:val="none"/>
-      </w:rPr>
-    </w:lvl>
-    <w:lvl w:ilvl="3">
-      <w:start w:val="1"/>
-      <w:numFmt w:val="bullet"/>
-      <w:lvlText w:val="●"/>
-      <w:lvlJc w:val="left"/>
-      <w:pPr>
-        <w:ind w:left="2880" w:hanging="360"/>
-      </w:pPr>
-      <w:rPr>
-        <w:u w:val="none"/>
-      </w:rPr>
-    </w:lvl>
-    <w:lvl w:ilvl="4">
-      <w:start w:val="1"/>
-      <w:numFmt w:val="bullet"/>
-      <w:lvlText w:val="●"/>
-      <w:lvlJc w:val="left"/>
-      <w:pPr>
-        <w:ind w:left="3600" w:hanging="360"/>
-      </w:pPr>
-      <w:rPr>
-        <w:u w:val="none"/>
-      </w:rPr>
-    </w:lvl>
-    <w:lvl w:ilvl="5">
-      <w:start w:val="1"/>
-      <w:numFmt w:val="bullet"/>
-      <w:lvlText w:val="●"/>
-      <w:lvlJc w:val="left"/>
-      <w:pPr>
-        <w:ind w:left="4320" w:hanging="360"/>
-      </w:pPr>
-      <w:rPr>
-        <w:u w:val="none"/>
-      </w:rPr>
-    </w:lvl>
-    <w:lvl w:ilvl="6">
-      <w:start w:val="1"/>
-      <w:numFmt w:val="bullet"/>
-      <w:lvlText w:val="●"/>
-      <w:lvlJc w:val="left"/>
-      <w:pPr>
-        <w:ind w:left="5040" w:hanging="360"/>
-      </w:pPr>
-      <w:rPr>
-        <w:u w:val="none"/>
-      </w:rPr>
-    </w:lvl>
-    <w:lvl w:ilvl="7">
-      <w:start w:val="1"/>
-      <w:numFmt w:val="bullet"/>
-      <w:lvlText w:val="●"/>
-      <w:lvlJc w:val="left"/>
-      <w:pPr>
-        <w:ind w:left="5760" w:hanging="360"/>
-      </w:pPr>
-      <w:rPr>
-        <w:u w:val="none"/>
-      </w:rPr>
-    </w:lvl>
-    <w:lvl w:ilvl="8">
-      <w:start w:val="1"/>
-      <w:numFmt w:val="bullet"/>
-      <w:lvlText w:val="●"/>
-      <w:lvlJc w:val="left"/>
-      <w:pPr>
-        <w:ind w:left="6480" w:hanging="360"/>
-      </w:pPr>
-      <w:rPr>
-        <w:u w:val="none"/>
-      </w:rPr>
-    </w:lvl>
-  </w:abstractNum>
-  <w:abstractNum w:abstractNumId="19">
-    <w:lvl w:ilvl="0">
-      <w:start w:val="1"/>
-      <w:numFmt w:val="bullet"/>
-      <w:lvlText w:val="●"/>
-      <w:lvlJc w:val="left"/>
-      <w:pPr>
-        <w:ind w:left="720" w:hanging="360"/>
-      </w:pPr>
-      <w:rPr>
-        <w:u w:val="none"/>
-      </w:rPr>
-    </w:lvl>
-    <w:lvl w:ilvl="1">
-      <w:start w:val="1"/>
-      <w:numFmt w:val="bullet"/>
-      <w:lvlText w:val="●"/>
-      <w:lvlJc w:val="left"/>
-      <w:pPr>
-        <w:ind w:left="1440" w:hanging="360"/>
-      </w:pPr>
-      <w:rPr>
-        <w:u w:val="none"/>
-      </w:rPr>
-    </w:lvl>
-    <w:lvl w:ilvl="2">
-      <w:start w:val="1"/>
-      <w:numFmt w:val="bullet"/>
-      <w:lvlText w:val="●"/>
-      <w:lvlJc w:val="left"/>
-      <w:pPr>
-        <w:ind w:left="2160" w:hanging="360"/>
-      </w:pPr>
-      <w:rPr>
-        <w:u w:val="none"/>
-      </w:rPr>
-    </w:lvl>
-    <w:lvl w:ilvl="3">
-      <w:start w:val="1"/>
-      <w:numFmt w:val="bullet"/>
-      <w:lvlText w:val="●"/>
-      <w:lvlJc w:val="left"/>
-      <w:pPr>
-        <w:ind w:left="2880" w:hanging="360"/>
-      </w:pPr>
-      <w:rPr>
-        <w:u w:val="none"/>
-      </w:rPr>
-    </w:lvl>
-    <w:lvl w:ilvl="4">
-      <w:start w:val="1"/>
-      <w:numFmt w:val="bullet"/>
-      <w:lvlText w:val="●"/>
-      <w:lvlJc w:val="left"/>
-      <w:pPr>
-        <w:ind w:left="3600" w:hanging="360"/>
-      </w:pPr>
-      <w:rPr>
-        <w:u w:val="none"/>
-      </w:rPr>
-    </w:lvl>
-    <w:lvl w:ilvl="5">
-      <w:start w:val="1"/>
-      <w:numFmt w:val="bullet"/>
-      <w:lvlText w:val="●"/>
-      <w:lvlJc w:val="left"/>
-      <w:pPr>
-        <w:ind w:left="4320" w:hanging="360"/>
-      </w:pPr>
-      <w:rPr>
-        <w:u w:val="none"/>
-      </w:rPr>
-    </w:lvl>
-    <w:lvl w:ilvl="6">
-      <w:start w:val="1"/>
-      <w:numFmt w:val="bullet"/>
-      <w:lvlText w:val="●"/>
-      <w:lvlJc w:val="left"/>
-      <w:pPr>
-        <w:ind w:left="5040" w:hanging="360"/>
-      </w:pPr>
-      <w:rPr>
-        <w:u w:val="none"/>
-      </w:rPr>
-    </w:lvl>
-    <w:lvl w:ilvl="7">
-      <w:start w:val="1"/>
-      <w:numFmt w:val="bullet"/>
-      <w:lvlText w:val="●"/>
-      <w:lvlJc w:val="left"/>
-      <w:pPr>
-        <w:ind w:left="5760" w:hanging="360"/>
-      </w:pPr>
-      <w:rPr>
-        <w:u w:val="none"/>
-      </w:rPr>
-    </w:lvl>
-    <w:lvl w:ilvl="8">
-      <w:start w:val="1"/>
-      <w:numFmt w:val="bullet"/>
-      <w:lvlText w:val="●"/>
-      <w:lvlJc w:val="left"/>
-      <w:pPr>
-        <w:ind w:left="6480" w:hanging="360"/>
-      </w:pPr>
-      <w:rPr>
-        <w:u w:val="none"/>
-      </w:rPr>
-    </w:lvl>
-  </w:abstractNum>
-  <w:abstractNum w:abstractNumId="20">
     <w:lvl w:ilvl="0">
       <w:start w:val="1"/>
       <w:numFmt w:val="bullet"/>
@@ -7307,24 +6496,6 @@
   </w:num>
   <w:num w:numId="14">
     <w:abstractNumId w:val="14"/>
-  </w:num>
-  <w:num w:numId="15">
-    <w:abstractNumId w:val="15"/>
-  </w:num>
-  <w:num w:numId="16">
-    <w:abstractNumId w:val="16"/>
-  </w:num>
-  <w:num w:numId="17">
-    <w:abstractNumId w:val="17"/>
-  </w:num>
-  <w:num w:numId="18">
-    <w:abstractNumId w:val="18"/>
-  </w:num>
-  <w:num w:numId="19">
-    <w:abstractNumId w:val="19"/>
-  </w:num>
-  <w:num w:numId="20">
-    <w:abstractNumId w:val="20"/>
   </w:num>
 </w:numbering>
 </file>
@@ -7499,176 +6670,28 @@
     <w:tblPr>
       <w:tblStyleRowBandSize w:val="1"/>
       <w:tblStyleColBandSize w:val="1"/>
-      <w:tblCellMar/>
     </w:tblPr>
-    <w:tblStylePr w:type="band1Horz">
-      <w:tcPr/>
-    </w:tblStylePr>
-    <w:tblStylePr w:type="band1Vert">
-      <w:tcPr/>
-    </w:tblStylePr>
-    <w:tblStylePr w:type="band2Horz">
-      <w:tcPr/>
-    </w:tblStylePr>
-    <w:tblStylePr w:type="band2Vert">
-      <w:tcPr/>
-    </w:tblStylePr>
-    <w:tblStylePr w:type="firstCol">
-      <w:tcPr/>
-    </w:tblStylePr>
-    <w:tblStylePr w:type="firstRow">
-      <w:tcPr/>
-    </w:tblStylePr>
-    <w:tblStylePr w:type="lastCol">
-      <w:tcPr/>
-    </w:tblStylePr>
-    <w:tblStylePr w:type="lastRow">
-      <w:tcPr/>
-    </w:tblStylePr>
-    <w:tblStylePr w:type="neCell">
-      <w:tcPr/>
-    </w:tblStylePr>
-    <w:tblStylePr w:type="nwCell">
-      <w:tcPr/>
-    </w:tblStylePr>
-    <w:tblStylePr w:type="seCell">
-      <w:tcPr/>
-    </w:tblStylePr>
-    <w:tblStylePr w:type="swCell">
-      <w:tcPr/>
-    </w:tblStylePr>
   </w:style>
   <w:style w:type="table" w:styleId="Table2">
     <w:basedOn w:val="TableNormal"/>
     <w:tblPr>
       <w:tblStyleRowBandSize w:val="1"/>
       <w:tblStyleColBandSize w:val="1"/>
-      <w:tblCellMar/>
     </w:tblPr>
-    <w:tblStylePr w:type="band1Horz">
-      <w:tcPr/>
-    </w:tblStylePr>
-    <w:tblStylePr w:type="band1Vert">
-      <w:tcPr/>
-    </w:tblStylePr>
-    <w:tblStylePr w:type="band2Horz">
-      <w:tcPr/>
-    </w:tblStylePr>
-    <w:tblStylePr w:type="band2Vert">
-      <w:tcPr/>
-    </w:tblStylePr>
-    <w:tblStylePr w:type="firstCol">
-      <w:tcPr/>
-    </w:tblStylePr>
-    <w:tblStylePr w:type="firstRow">
-      <w:tcPr/>
-    </w:tblStylePr>
-    <w:tblStylePr w:type="lastCol">
-      <w:tcPr/>
-    </w:tblStylePr>
-    <w:tblStylePr w:type="lastRow">
-      <w:tcPr/>
-    </w:tblStylePr>
-    <w:tblStylePr w:type="neCell">
-      <w:tcPr/>
-    </w:tblStylePr>
-    <w:tblStylePr w:type="nwCell">
-      <w:tcPr/>
-    </w:tblStylePr>
-    <w:tblStylePr w:type="seCell">
-      <w:tcPr/>
-    </w:tblStylePr>
-    <w:tblStylePr w:type="swCell">
-      <w:tcPr/>
-    </w:tblStylePr>
   </w:style>
   <w:style w:type="table" w:styleId="Table3">
     <w:basedOn w:val="TableNormal"/>
     <w:tblPr>
       <w:tblStyleRowBandSize w:val="1"/>
       <w:tblStyleColBandSize w:val="1"/>
-      <w:tblCellMar/>
     </w:tblPr>
-    <w:tblStylePr w:type="band1Horz">
-      <w:tcPr/>
-    </w:tblStylePr>
-    <w:tblStylePr w:type="band1Vert">
-      <w:tcPr/>
-    </w:tblStylePr>
-    <w:tblStylePr w:type="band2Horz">
-      <w:tcPr/>
-    </w:tblStylePr>
-    <w:tblStylePr w:type="band2Vert">
-      <w:tcPr/>
-    </w:tblStylePr>
-    <w:tblStylePr w:type="firstCol">
-      <w:tcPr/>
-    </w:tblStylePr>
-    <w:tblStylePr w:type="firstRow">
-      <w:tcPr/>
-    </w:tblStylePr>
-    <w:tblStylePr w:type="lastCol">
-      <w:tcPr/>
-    </w:tblStylePr>
-    <w:tblStylePr w:type="lastRow">
-      <w:tcPr/>
-    </w:tblStylePr>
-    <w:tblStylePr w:type="neCell">
-      <w:tcPr/>
-    </w:tblStylePr>
-    <w:tblStylePr w:type="nwCell">
-      <w:tcPr/>
-    </w:tblStylePr>
-    <w:tblStylePr w:type="seCell">
-      <w:tcPr/>
-    </w:tblStylePr>
-    <w:tblStylePr w:type="swCell">
-      <w:tcPr/>
-    </w:tblStylePr>
   </w:style>
   <w:style w:type="table" w:styleId="Table4">
     <w:basedOn w:val="TableNormal"/>
     <w:tblPr>
       <w:tblStyleRowBandSize w:val="1"/>
       <w:tblStyleColBandSize w:val="1"/>
-      <w:tblCellMar/>
     </w:tblPr>
-    <w:tblStylePr w:type="band1Horz">
-      <w:tcPr/>
-    </w:tblStylePr>
-    <w:tblStylePr w:type="band1Vert">
-      <w:tcPr/>
-    </w:tblStylePr>
-    <w:tblStylePr w:type="band2Horz">
-      <w:tcPr/>
-    </w:tblStylePr>
-    <w:tblStylePr w:type="band2Vert">
-      <w:tcPr/>
-    </w:tblStylePr>
-    <w:tblStylePr w:type="firstCol">
-      <w:tcPr/>
-    </w:tblStylePr>
-    <w:tblStylePr w:type="firstRow">
-      <w:tcPr/>
-    </w:tblStylePr>
-    <w:tblStylePr w:type="lastCol">
-      <w:tcPr/>
-    </w:tblStylePr>
-    <w:tblStylePr w:type="lastRow">
-      <w:tcPr/>
-    </w:tblStylePr>
-    <w:tblStylePr w:type="neCell">
-      <w:tcPr/>
-    </w:tblStylePr>
-    <w:tblStylePr w:type="nwCell">
-      <w:tcPr/>
-    </w:tblStylePr>
-    <w:tblStylePr w:type="seCell">
-      <w:tcPr/>
-    </w:tblStylePr>
-    <w:tblStylePr w:type="swCell">
-      <w:tcPr/>
-    </w:tblStylePr>
   </w:style>
 </w:styles>
 </file>

</xml_diff>